<commit_message>
Tag Taylor Swift and Kate Bush pieces as music
Retrospectively adding category "music" to two already-published
pieces. Also added a <category> tag to each source docx so a future
re-seed of the metadata stays consistent.

Co-Authored-By: Claude Sonnet 5 <noreply@anthropic.com>
Claude-Session: https://claude.ai/code/session_011XomYBEJr6n2NCmbT81mT9
</commit_message>
<xml_diff>
--- a/content-src/docx/A TLS 2018 07 27 Kate Bush's Wuthering Heights revisited.docx
+++ b/content-src/docx/A TLS 2018 07 27 Kate Bush's Wuthering Heights revisited.docx
@@ -40,6 +40,11 @@
           <w:color w:val="121212"/>
         </w:rPr>
         <w:t>&lt;/details&gt;</w:t>
+      </w:r>
+    </w:p>
+    <w:p>
+      <w:r>
+        <w:t>&lt;category&gt;music&lt;/category&gt;</w:t>
       </w:r>
     </w:p>
     <w:p/>

</xml_diff>